<commit_message>
docs: update engineering report for October 21 specifications
</commit_message>
<xml_diff>
--- a/docs/hakobi-report/output/HAKOBI_技術レポート.docx
+++ b/docs/hakobi-report/output/HAKOBI_技術レポート.docx
@@ -207,7 +207,7 @@
           <w:rFonts w:ascii="Calibri" w:hAnsi="Calibri" w:eastAsia="Yu Gothic"/>
           <w:sz w:val="22"/>
         </w:rPr>
-        <w:t>作成日　2026年10月17日</w:t>
+        <w:t>作成日　2026年10月21日</w:t>
       </w:r>
     </w:p>
     <w:p>
@@ -220,7 +220,7 @@
           <w:rFonts w:ascii="Calibri" w:hAnsi="Calibri" w:eastAsia="Yu Gothic"/>
           <w:sz w:val="20"/>
         </w:rPr>
-        <w:t>対象　2026年10月17日時点のHAKOBI（デスクトップ版1.0.5、コミットf9c1bc6に8.2節の修正を加えたもの）</w:t>
+        <w:t>対象　2026年10月21日時点のHAKOBI（デスクトップ版1.0.5、コミットa823ba5）</w:t>
       </w:r>
     </w:p>
     <w:p>
@@ -244,7 +244,7 @@
         <w:rPr>
           <w:rFonts w:ascii="Calibri" w:hAnsi="Calibri" w:eastAsia="Yu Mincho"/>
         </w:rPr>
-        <w:t>係やグループで仕事を進めるとき、ほかの人の仕事がどこまで進んでいるかは、本人に聞かないと分からないことがある。定例や週報の前には、記憶をたどって別の一覧を作り、報告のたびに同じ内容を書き直す手間もかかる。この手間を減らし、チームの予定・担当・進捗を同じ画面で確かめられるようにするため、業務管理ツールHAKOBIを開発した。本レポートでは、2026年10月17日時点の実装について、設計、実装、品質の確認結果を報告する。</w:t>
+        <w:t>係やグループで仕事を進めるとき、ほかの人の仕事がどこまで進んでいるかは、本人に聞かないと分からないことがある。定例や週報の前には、記憶をたどって別の一覧を作り、報告のたびに同じ内容を書き直す手間もかかる。この手間を減らし、チームの予定・担当・進捗を同じ画面で確かめられるようにするため、業務管理ツールHAKOBIを開発した。本レポートでは、2026年10月21日時点の実装について、設計、実装、品質の確認結果を報告する。</w:t>
       </w:r>
     </w:p>
     <w:p>
@@ -260,7 +260,7 @@
         <w:rPr>
           <w:rFonts w:ascii="Calibri" w:hAnsi="Calibri" w:eastAsia="Yu Mincho"/>
         </w:rPr>
-        <w:t>2026年3月に個人用として開発を始め、5月にチーム用を加えた。10月17日に型チェック4種とWebのビルドを実行し、すべて成功した。自動テストは、最初の実行で1コマンドが時間切れとなった。アプリの定期処理のタイマーがテストのプロセスの終了を妨げていたためで、これを直したあとは15コマンドすべてが合格した。10月9日の全体確認で見つけた13件の不具合は修正済みである。これらの結果から、目指した五つの姿に対応する機能を実装できたと判断した。導入による効果はまだ測っていない。今後は定例と週報にかかる時間などを測り、効果を確かめる。</w:t>
+        <w:t>2026年3月に個人用として開発を始め、5月にチーム用を加えた。10月17日に型チェック4種とWebのビルドを実行し、すべて成功した。自動テストは、最初の実行で1コマンドが時間切れとなった。アプリの定期処理のタイマーがテストのプロセスの終了を妨げていたためで、これを直したあとは15コマンドすべてが合格した。10月9日の全体確認で見つけた13件の不具合は修正済みである。10月21日の追加確認では型チェックとビルドは成功したが、ガント表示位置テストの失敗が残った。これらの結果から、目指した五つの姿に対応する機能を実装できたと判断した。導入による効果はまだ測っていない。今後は定例と週報にかかる時間などを測り、効果を確かめる。</w:t>
       </w:r>
     </w:p>
     <w:p>
@@ -973,7 +973,7 @@
           <w:rFonts w:ascii="Calibri" w:hAnsi="Calibri" w:eastAsia="Yu Gothic"/>
           <w:sz w:val="20"/>
         </w:rPr>
-        <w:t>13</w:t>
+        <w:t>14</w:t>
       </w:r>
     </w:p>
     <w:p>
@@ -1004,7 +1004,7 @@
           <w:rFonts w:ascii="Calibri" w:hAnsi="Calibri" w:eastAsia="Yu Gothic"/>
           <w:sz w:val="20"/>
         </w:rPr>
-        <w:t>14</w:t>
+        <w:t>15</w:t>
       </w:r>
     </w:p>
     <w:p>
@@ -1067,7 +1067,7 @@
           <w:rFonts w:ascii="Calibri" w:hAnsi="Calibri" w:eastAsia="Yu Gothic"/>
           <w:sz w:val="20"/>
         </w:rPr>
-        <w:t>15</w:t>
+        <w:t>16</w:t>
       </w:r>
     </w:p>
     <w:p>
@@ -1129,7 +1129,7 @@
           <w:rFonts w:ascii="Calibri" w:hAnsi="Calibri" w:eastAsia="Yu Gothic"/>
           <w:sz w:val="20"/>
         </w:rPr>
-        <w:t>16</w:t>
+        <w:t>17</w:t>
       </w:r>
     </w:p>
     <w:p>
@@ -1160,7 +1160,7 @@
           <w:rFonts w:ascii="Calibri" w:hAnsi="Calibri" w:eastAsia="Yu Gothic"/>
           <w:sz w:val="20"/>
         </w:rPr>
-        <w:t>17</w:t>
+        <w:t>18</w:t>
       </w:r>
     </w:p>
     <w:p>
@@ -1191,7 +1191,7 @@
           <w:rFonts w:ascii="Calibri" w:hAnsi="Calibri" w:eastAsia="Yu Gothic"/>
           <w:sz w:val="20"/>
         </w:rPr>
-        <w:t>17</w:t>
+        <w:t>19</w:t>
       </w:r>
     </w:p>
     <w:p>
@@ -1223,7 +1223,7 @@
           <w:rFonts w:ascii="Calibri" w:hAnsi="Calibri" w:eastAsia="Yu Gothic"/>
           <w:sz w:val="21"/>
         </w:rPr>
-        <w:t>18</w:t>
+        <w:t>19</w:t>
       </w:r>
     </w:p>
     <w:p>
@@ -1254,7 +1254,7 @@
           <w:rFonts w:ascii="Calibri" w:hAnsi="Calibri" w:eastAsia="Yu Gothic"/>
           <w:sz w:val="20"/>
         </w:rPr>
-        <w:t>18</w:t>
+        <w:t>19</w:t>
       </w:r>
     </w:p>
     <w:p>
@@ -1285,7 +1285,7 @@
           <w:rFonts w:ascii="Calibri" w:hAnsi="Calibri" w:eastAsia="Yu Gothic"/>
           <w:sz w:val="20"/>
         </w:rPr>
-        <w:t>18</w:t>
+        <w:t>19</w:t>
       </w:r>
     </w:p>
     <w:p>
@@ -1316,7 +1316,7 @@
           <w:rFonts w:ascii="Calibri" w:hAnsi="Calibri" w:eastAsia="Yu Gothic"/>
           <w:sz w:val="20"/>
         </w:rPr>
-        <w:t>19</w:t>
+        <w:t>20</w:t>
       </w:r>
     </w:p>
     <w:p>
@@ -1347,7 +1347,7 @@
           <w:rFonts w:ascii="Calibri" w:hAnsi="Calibri" w:eastAsia="Yu Gothic"/>
           <w:sz w:val="20"/>
         </w:rPr>
-        <w:t>19</w:t>
+        <w:t>21</w:t>
       </w:r>
     </w:p>
     <w:p>
@@ -1379,7 +1379,7 @@
           <w:rFonts w:ascii="Calibri" w:hAnsi="Calibri" w:eastAsia="Yu Gothic"/>
           <w:sz w:val="21"/>
         </w:rPr>
-        <w:t>20</w:t>
+        <w:t>21</w:t>
       </w:r>
     </w:p>
     <w:p>
@@ -1410,7 +1410,7 @@
           <w:rFonts w:ascii="Calibri" w:hAnsi="Calibri" w:eastAsia="Yu Gothic"/>
           <w:sz w:val="20"/>
         </w:rPr>
-        <w:t>20</w:t>
+        <w:t>21</w:t>
       </w:r>
     </w:p>
     <w:p>
@@ -1441,7 +1441,7 @@
           <w:rFonts w:ascii="Calibri" w:hAnsi="Calibri" w:eastAsia="Yu Gothic"/>
           <w:sz w:val="20"/>
         </w:rPr>
-        <w:t>20</w:t>
+        <w:t>21</w:t>
       </w:r>
     </w:p>
     <w:p>
@@ -1472,7 +1472,7 @@
           <w:rFonts w:ascii="Calibri" w:hAnsi="Calibri" w:eastAsia="Yu Gothic"/>
           <w:sz w:val="20"/>
         </w:rPr>
-        <w:t>20</w:t>
+        <w:t>22</w:t>
       </w:r>
     </w:p>
     <w:p>
@@ -1503,7 +1503,7 @@
           <w:rFonts w:ascii="Calibri" w:hAnsi="Calibri" w:eastAsia="Yu Gothic"/>
           <w:sz w:val="20"/>
         </w:rPr>
-        <w:t>20</w:t>
+        <w:t>22</w:t>
       </w:r>
     </w:p>
     <w:p>
@@ -1534,7 +1534,7 @@
           <w:rFonts w:ascii="Calibri" w:hAnsi="Calibri" w:eastAsia="Yu Gothic"/>
           <w:sz w:val="20"/>
         </w:rPr>
-        <w:t>21</w:t>
+        <w:t>22</w:t>
       </w:r>
     </w:p>
     <w:p>
@@ -1566,7 +1566,7 @@
           <w:rFonts w:ascii="Calibri" w:hAnsi="Calibri" w:eastAsia="Yu Gothic"/>
           <w:sz w:val="21"/>
         </w:rPr>
-        <w:t>21</w:t>
+        <w:t>22</w:t>
       </w:r>
     </w:p>
     <w:p>
@@ -1597,7 +1597,7 @@
           <w:rFonts w:ascii="Calibri" w:hAnsi="Calibri" w:eastAsia="Yu Gothic"/>
           <w:sz w:val="20"/>
         </w:rPr>
-        <w:t>21</w:t>
+        <w:t>22</w:t>
       </w:r>
     </w:p>
     <w:p>
@@ -1628,7 +1628,7 @@
           <w:rFonts w:ascii="Calibri" w:hAnsi="Calibri" w:eastAsia="Yu Gothic"/>
           <w:sz w:val="20"/>
         </w:rPr>
-        <w:t>21</w:t>
+        <w:t>23</w:t>
       </w:r>
     </w:p>
     <w:p>
@@ -1659,7 +1659,7 @@
           <w:rFonts w:ascii="Calibri" w:hAnsi="Calibri" w:eastAsia="Yu Gothic"/>
           <w:sz w:val="20"/>
         </w:rPr>
-        <w:t>22</w:t>
+        <w:t>24</w:t>
       </w:r>
     </w:p>
     <w:p>
@@ -1691,7 +1691,7 @@
           <w:rFonts w:ascii="Calibri" w:hAnsi="Calibri" w:eastAsia="Yu Gothic"/>
           <w:sz w:val="21"/>
         </w:rPr>
-        <w:t>23</w:t>
+        <w:t>25</w:t>
       </w:r>
     </w:p>
     <w:p>
@@ -1722,7 +1722,7 @@
           <w:rFonts w:ascii="Calibri" w:hAnsi="Calibri" w:eastAsia="Yu Gothic"/>
           <w:sz w:val="20"/>
         </w:rPr>
-        <w:t>23</w:t>
+        <w:t>25</w:t>
       </w:r>
     </w:p>
     <w:p>
@@ -1753,7 +1753,7 @@
           <w:rFonts w:ascii="Calibri" w:hAnsi="Calibri" w:eastAsia="Yu Gothic"/>
           <w:sz w:val="20"/>
         </w:rPr>
-        <w:t>24</w:t>
+        <w:t>25</w:t>
       </w:r>
     </w:p>
     <w:p>
@@ -1784,7 +1784,7 @@
           <w:rFonts w:ascii="Calibri" w:hAnsi="Calibri" w:eastAsia="Yu Gothic"/>
           <w:sz w:val="20"/>
         </w:rPr>
-        <w:t>24</w:t>
+        <w:t>26</w:t>
       </w:r>
     </w:p>
     <w:p>
@@ -1815,7 +1815,7 @@
           <w:rFonts w:ascii="Calibri" w:hAnsi="Calibri" w:eastAsia="Yu Gothic"/>
           <w:sz w:val="20"/>
         </w:rPr>
-        <w:t>24</w:t>
+        <w:t>26</w:t>
       </w:r>
     </w:p>
     <w:p>
@@ -1846,7 +1846,7 @@
           <w:rFonts w:ascii="Calibri" w:hAnsi="Calibri" w:eastAsia="Yu Gothic"/>
           <w:sz w:val="20"/>
         </w:rPr>
-        <w:t>25</w:t>
+        <w:t>26</w:t>
       </w:r>
     </w:p>
     <w:p>
@@ -1878,7 +1878,7 @@
           <w:rFonts w:ascii="Calibri" w:hAnsi="Calibri" w:eastAsia="Yu Gothic"/>
           <w:sz w:val="21"/>
         </w:rPr>
-        <w:t>25</w:t>
+        <w:t>27</w:t>
       </w:r>
     </w:p>
     <w:p>
@@ -1909,7 +1909,7 @@
           <w:rFonts w:ascii="Calibri" w:hAnsi="Calibri" w:eastAsia="Yu Gothic"/>
           <w:sz w:val="20"/>
         </w:rPr>
-        <w:t>25</w:t>
+        <w:t>27</w:t>
       </w:r>
     </w:p>
     <w:p>
@@ -1940,7 +1940,7 @@
           <w:rFonts w:ascii="Calibri" w:hAnsi="Calibri" w:eastAsia="Yu Gothic"/>
           <w:sz w:val="20"/>
         </w:rPr>
-        <w:t>26</w:t>
+        <w:t>28</w:t>
       </w:r>
     </w:p>
     <w:p>
@@ -1971,7 +1971,7 @@
           <w:rFonts w:ascii="Calibri" w:hAnsi="Calibri" w:eastAsia="Yu Gothic"/>
           <w:sz w:val="20"/>
         </w:rPr>
-        <w:t>26</w:t>
+        <w:t>28</w:t>
       </w:r>
     </w:p>
     <w:p>
@@ -2003,7 +2003,7 @@
           <w:rFonts w:ascii="Calibri" w:hAnsi="Calibri" w:eastAsia="Yu Gothic"/>
           <w:sz w:val="21"/>
         </w:rPr>
-        <w:t>27</w:t>
+        <w:t>28</w:t>
       </w:r>
     </w:p>
     <w:p>
@@ -2034,7 +2034,7 @@
           <w:rFonts w:ascii="Calibri" w:hAnsi="Calibri" w:eastAsia="Yu Gothic"/>
           <w:sz w:val="20"/>
         </w:rPr>
-        <w:t>27</w:t>
+        <w:t>28</w:t>
       </w:r>
     </w:p>
     <w:p>
@@ -2065,7 +2065,7 @@
           <w:rFonts w:ascii="Calibri" w:hAnsi="Calibri" w:eastAsia="Yu Gothic"/>
           <w:sz w:val="20"/>
         </w:rPr>
-        <w:t>27</w:t>
+        <w:t>29</w:t>
       </w:r>
     </w:p>
     <w:p>
@@ -2097,7 +2097,7 @@
           <w:rFonts w:ascii="Calibri" w:hAnsi="Calibri" w:eastAsia="Yu Gothic"/>
           <w:sz w:val="21"/>
         </w:rPr>
-        <w:t>28</w:t>
+        <w:t>30</w:t>
       </w:r>
     </w:p>
     <w:p>
@@ -2129,7 +2129,7 @@
           <w:rFonts w:ascii="Calibri" w:hAnsi="Calibri" w:eastAsia="Yu Gothic"/>
           <w:sz w:val="21"/>
         </w:rPr>
-        <w:t>29</w:t>
+        <w:t>32</w:t>
       </w:r>
     </w:p>
     <w:p>
@@ -2161,7 +2161,7 @@
           <w:rFonts w:ascii="Calibri" w:hAnsi="Calibri" w:eastAsia="Yu Gothic"/>
           <w:sz w:val="21"/>
         </w:rPr>
-        <w:t>30</w:t>
+        <w:t>33</w:t>
       </w:r>
       <w:r>
         <w:fldChar w:fldCharType="end"/>
@@ -3961,7 +3961,7 @@
         <w:rPr>
           <w:rFonts w:ascii="Calibri" w:hAnsi="Calibri" w:eastAsia="Yu Mincho"/>
         </w:rPr>
-        <w:t>対象は個人用のデスクトップ版、チーム接続のデスクトップ版、ブラウザ版の画面、チーム用のサーバー、自動テストおよび運用文書である。内容は2026年10月17日時点の実装に基づく。</w:t>
+        <w:t>対象は個人用のデスクトップ版、チーム接続のデスクトップ版、ブラウザ版の画面、チーム用のサーバー、自動テストおよび運用文書である。内容は2026年10月21日時点の実装に基づく。10月17日の検証結果と、10月21日の追加確認は区別して示す。画面の図は10月17日に撮影したデモであり、その後のボタン名や配置の変更は本文で説明する[I7][I8]。</w:t>
       </w:r>
     </w:p>
     <w:p>
@@ -4160,6 +4160,14 @@
           <w:rFonts w:ascii="Calibri" w:hAnsi="Calibri" w:eastAsia="Yu Mincho"/>
         </w:rPr>
         <w:t>10月9日に、デスクトップ版からチームのサーバーへ接続できるようにした。同日の全体確認で見つけた13件の不具合は、修正して1.0.1として配布物を更新した[I4]。10月13日には、OSの通知と未読バッジ、サーバーからのインストーラーの配布と新しいバージョンのお知らせ（1.0.5）を加えた。10月14日から17日にかけては、ToDoリスト、定例モード、報告のリマインド、移動・操作のパレット、管理者向けの機能、ライトテーマの作り直しを実装した[I5]。</w:t>
+      </w:r>
+    </w:p>
+    <w:p>
+      <w:r>
+        <w:rPr>
+          <w:rFonts w:ascii="Calibri" w:hAnsi="Calibri" w:eastAsia="Yu Mincho"/>
+        </w:rPr>
+        <w:t>10月18日には、通常のタスクの繰り返しに「毎年」を加えた。10月18日から21日にかけては、絞り込みの範囲、遅れと報告なしの判定、定例の途中経過を保存する機能、キーボード操作、狭い画面と文字拡大時の表示、通信失敗後の再試行を改善した[I8]。</w:t>
       </w:r>
     </w:p>
     <w:p>
@@ -7225,7 +7233,15 @@
         <w:rPr>
           <w:rFonts w:ascii="Calibri" w:hAnsi="Calibri" w:eastAsia="Yu Mincho"/>
         </w:rPr>
-        <w:t>バーの色は予定に対する遅れを示す。経過した日数の割合を「予定の進捗」とし、実際の進捗率との差を日数に換算する。差が設定の日数（既定は2日）以上なら「遅れ」として橙色にする。期限を過ぎたものは赤、開始前は灰色、それ以外は青で示す。土日・祝日を除いて数える設定もある[I1][I2]。色は入力された日程と進捗から計算した目安であり、遅れの理由は進捗ログや本人の話で確かめる。</w:t>
+        <w:t>バーの色は予定に対する遅れを示す。開始日から期限までの日数に対し、昨日までに過ぎた日数と今日の半日分から「予定の進捗」を求め、実際の進捗率との差を日数に換算する。差が設定の日数（既定は2日）以上か、進捗率の差が50ポイント以上なら「遅れ」として橙色にする。期限を過ぎたものは赤、開始前は灰色、それ以外は青で示す。土日・祝日を除いて数える設定もある。完了・アーカイブ・保留中・ToDoリスト、開始日か期限のないタスクは遅れの判定から外す。ガント・報告・チームの画面は同じ判定を使う[I8]。色は入力された日程と進捗から計算した目安であり、遅れの理由は進捗ログや本人の話で確かめる。</w:t>
+      </w:r>
+    </w:p>
+    <w:p>
+      <w:r>
+        <w:rPr>
+          <w:rFonts w:ascii="Calibri" w:hAnsi="Calibri" w:eastAsia="Yu Mincho"/>
+        </w:rPr>
+        <w:t>ガントは初回表示と「今日に戻る」で今日へ移動する。編集、同期、期間やズーム、表示幅の変更では、見ている日付を保つ。タスク名の列幅はドラッグとキーボードで調整できる。保留中の行には再開ボタンを常に表示する[I2][I8]。</w:t>
       </w:r>
     </w:p>
     <w:p>
@@ -7344,7 +7360,7 @@
         <w:rPr>
           <w:rFonts w:ascii="Calibri" w:hAnsi="Calibri" w:eastAsia="Yu Mincho"/>
         </w:rPr>
-        <w:t>チーム画面の例を図6に示す。上段の「いま稼働中」には、メンバーがタイマーで計測している仕事を表示する。中段には、期限を過ぎた仕事と、期限まで3日以内の仕事を並べる。下段の「メンバーの負荷」には、メンバーごとの進行中・保留中・期限超過の件数と、今日の作業時間を表示する。仕事の偏りや、手助けが必要な案件を話し合う材料になる。</w:t>
+        <w:t>チーム画面の例を図6に示す。上段の「いま稼働中」には、メンバーがタイマーで計測している仕事を表示する。その下の「メンバーの負荷」には、メンバーごとの未完了・保留中・期限超過の件数と、今日の作業時間を表示する。下部には、期限を過ぎた仕事と、期限まで3日以内の仕事を並べる。仕事の偏りや、手助けが必要な案件を話し合う材料になる。</w:t>
       </w:r>
     </w:p>
     <w:p>
@@ -7411,7 +7427,7 @@
         <w:rPr>
           <w:rFonts w:ascii="Calibri" w:hAnsi="Calibri" w:eastAsia="Yu Mincho"/>
         </w:rPr>
-        <w:t>計測中のタイマーは、利用者ごとに1つまでとした。チーム画面に表示するのは、各メンバーがこのタイマーで計測している仕事である。</w:t>
+        <w:t>計測中のタイマーは、利用者ごとに1つまでとした。チーム画面には遅れと報告なしの件数も示し、件数から該当する仕事を開ける。ここから開く担当者の絞り込みは一時的なもので、一覧や報告タブに保存した担当者の選択を書き換えない[I8]。チーム画面に表示するのは、各メンバーがこのタイマーで計測している仕事である。</w:t>
       </w:r>
     </w:p>
     <w:p>
@@ -8210,7 +8226,7 @@
         <w:rPr>
           <w:rFonts w:ascii="Calibri" w:hAnsi="Calibri" w:eastAsia="Yu Mincho"/>
         </w:rPr>
-        <w:t>画面の上部には「報告なし」「要相談」「保留中」「期限超過」「期間中に延期」の件数を表示する。「報告なし」は期間内に進捗ログもメモの更新もないタスクを指す。仕事をしていないという意味ではないため、本人に状況を確かめる材料として扱う。</w:t>
+        <w:t>画面の上部には「報告なし」「要相談」「保留中」「期限超過」「期間中に延期」の件数を表示する。「報告なし」は期間内に主担当・副担当の進捗ログもメモの更新もないタスクを指す。完了・保留中・ToDoリストと、未着手で開始日がないもの、今日以降に開始するもの、選択期間より後に開始するものは除く。担当者がいない場合と、投稿者の記録がない個人用の投稿は、すべての進捗ログを数える[I8]。仕事をしていないという意味ではないため、本人に状況を確かめる材料として扱う。</w:t>
       </w:r>
     </w:p>
     <w:p>
@@ -8219,6 +8235,14 @@
           <w:rFonts w:ascii="Calibri" w:hAnsi="Calibri" w:eastAsia="Yu Mincho"/>
         </w:rPr>
         <w:t>進捗率、期限、メモ、サブタスク、進捗ログは、報告タブから直接更新できる。定例で決まった内容を反映するために、詳細画面へ戻る必要はない。表示中の内容はMarkdownの文章とCSV（Comma-Separated Values）で取り出せる。</w:t>
+      </w:r>
+    </w:p>
+    <w:p>
+      <w:r>
+        <w:rPr>
+          <w:rFonts w:ascii="Calibri" w:hAnsi="Calibri" w:eastAsia="Yu Mincho"/>
+        </w:rPr>
+        <w:t>カテゴリと検索の絞り込みは一覧と共通だが、報告タブの担当者はタブ内の選択で決まる。一覧で選んだ担当者には連動しない。要約の件数も報告タブで選んだ担当者の範囲で数える。期間中の延期は、期間末の期限が期間初めより後ろになった場合に、変更履歴で期限が後ろへ動いた回数を数える。元の日付へ戻した変更、短縮、時刻だけの変更は含めない[I8]。</w:t>
       </w:r>
     </w:p>
     <w:p>
@@ -8304,7 +8328,7 @@
         <w:rPr>
           <w:rFonts w:ascii="Calibri" w:hAnsi="Calibri" w:eastAsia="Yu Mincho"/>
         </w:rPr>
-        <w:t>追加の確認や対応が決まったら、画面の右側からその場でタスクを作れる。担当は表示中の人、開始日は今日になる。定例メモ、追加したタスク、担当者ごとの時間は、「定例の内容をコピー」でまとめて取り出し、議事録に貼れる。定例メモは報告の画面を離れると消えるため、残すときは先にコピーする。</w:t>
+        <w:t>追加の確認や対応が決まったら、画面の右側からその場でタスクを作れる。担当は表示中の人、開始日は今日になる。定例メモ、追加したタスク、担当者ごとの時間は、「議事録をコピー」でまとめて取り出せる。定例の途中経過は端末のlocalStorageに保存し、開始から12時間以内なら画面の移動や再読み込みの後も再開できる。ほかのPCとは共有しないため、議事録として残す場合はコピーする[I8]。</w:t>
       </w:r>
     </w:p>
     <w:p>
@@ -8312,7 +8336,7 @@
         <w:rPr>
           <w:rFonts w:ascii="Calibri" w:hAnsi="Calibri" w:eastAsia="Yu Mincho"/>
         </w:rPr>
-        <w:t>管理者が定例の曜日を設定すると、報告のリマインドが届く。定例の前日17時以降に、直近7日に進捗ログもメモの更新もない担当タスクがある人へ、1日1回通知を出す。サーバーはこの条件を1分ごとに確かめる[I2]。</w:t>
+        <w:t>管理者が定例の曜日を設定すると、報告のリマインドが届く。定例の前日17時以降に、直近7日に進捗ログもメモの更新もない担当タスクがある人へ、1日1回通知を出す。サーバーはこの条件を1分ごとに確かめる[I2]。報告なしの判定は、主担当・副担当の投稿とメモの更新を対象とし、保留中・完了・ToDoリストや開始前の仕事を除く[I8]。</w:t>
       </w:r>
     </w:p>
     <w:p>
@@ -8547,7 +8571,7 @@
         <w:rPr>
           <w:rFonts w:ascii="Calibri" w:hAnsi="Calibri" w:eastAsia="Yu Mincho"/>
         </w:rPr>
-        <w:t>繰り返す仕事には二つの形を用意した。週次の資料作成のような仕事は、通常のタスクに繰り返しを設定する。完了すると次回のタスクを作り、土日・祝日を飛ばす設定もできる。</w:t>
+        <w:t>繰り返す仕事には二つの形を用意した。週次の資料作成のような仕事は、通常のタスクに毎日・毎週・毎月・毎年の繰り返しを設定する。完了すると次回のタスクを作り、土日・祝日を飛ばす設定もできる。毎年の2月29日は、翌年が平年なら2月28日にする。完了を取り消しても作成済みの次回分は残り、再び完了にしても重複して作らない。完了を取り消した後の通知から、残った次回分をアーカイブできる[I8]。</w:t>
       </w:r>
     </w:p>
     <w:p>
@@ -8649,6 +8673,22 @@
         <w:rPr>
           <w:rFonts w:ascii="Calibri" w:hAnsi="Calibri" w:eastAsia="Yu Mincho"/>
         </w:rPr>
+        <w:t>一覧の担当・カテゴリ・検索の絞り込みは、ガント、カンバン、計画、概要にも反映する。見出しの横に絞り込み中の条件を示し、その場で解除できる。タスク追加の初期値は、担当が一覧で選んだ人（未選択なら自分）、カテゴリが選択中のもの、開始日が今日である。追加したタスクが条件から外れる場合は、絞り込みを解除して開く操作を案内する。集計外カテゴリの設定は集計と表示の対象を変えるもので、アクセス制限ではない[I2][I8]。</w:t>
+      </w:r>
+    </w:p>
+    <w:p>
+      <w:r>
+        <w:rPr>
+          <w:rFonts w:ascii="Calibri" w:hAnsi="Calibri" w:eastAsia="Yu Mincho"/>
+        </w:rPr>
+        <w:t>初回の案内は「はじめに」から読み直せる。進捗、期限、担当などの変更には「元に戻す」を用意した。上部タブは矢印キーで移動でき、同じタブを押しても画面を切り替えない。小窓を閉じると元の操作箇所へフォーカスを戻す。通信に失敗したときは入力を残して再試行を案内し、取得できない状態を0件と区別する[I8]。</w:t>
+      </w:r>
+    </w:p>
+    <w:p>
+      <w:r>
+        <w:rPr>
+          <w:rFonts w:ascii="Calibri" w:hAnsi="Calibri" w:eastAsia="Yu Mincho"/>
+        </w:rPr>
         <w:t>動作を軽くするため、ガント、一覧、詳細以外の画面は必要になったときに読み込む。計測中の経過秒数は表示する部品の中だけで数え、画面全体を毎秒描き直さない。ガントと一覧の行は、内容が変わらなければ描き直さない[I2]。</w:t>
       </w:r>
     </w:p>
@@ -8880,7 +8920,7 @@
         <w:rPr>
           <w:rFonts w:ascii="Calibri" w:hAnsi="Calibri" w:eastAsia="Yu Mincho"/>
         </w:rPr>
-        <w:t>自動テストはNode.jsで実行するスクリプト36ファイルと、Node.jsのテストランナーで実行するテスト12ファイルからなる。テストはそれぞれ独立した一時DB、一時フォルダ、一時サーバーを使い、運用中のDBやサービスに触れない。画面の動作は実際のElectronを表示せずに起動して確かめる[I3]。対象は保存先の変更、削除、依存関係の再計算、同時編集、タイマー、認証、取り込み、配布、進捗ログ、保留、ToDoリスト、ガントの表示位置などである。</w:t>
+        <w:t>10月17日の検証では、Node.jsで実行するスクリプト36ファイルと、Node.jsのテストランナーで実行するテスト12ファイルを対象とした。テストはそれぞれ独立した一時DB、一時フォルダ、一時サーバーを使い、運用中のDBやサービスに触れない。画面の動作は実際のElectronを表示せずに起動して確かめる[I3]。対象は保存先の変更、削除、依存関係の再計算、同時編集、タイマー、認証、取り込み、配布、進捗ログ、保留、ToDoリスト、ガントの表示位置などである。</w:t>
       </w:r>
     </w:p>
     <w:p>
@@ -9606,6 +9646,28 @@
       </w:r>
     </w:p>
     <w:p>
+      <w:r>
+        <w:rPr>
+          <w:rFonts w:ascii="Calibri" w:hAnsi="Calibri" w:eastAsia="Yu Mincho"/>
+        </w:rPr>
+        <w:t>10月21日には、現在の実装に対して型チェック4種、Webのビルド、年次繰り返し・進捗集計と延期と遅れ・報告リマインド・期限通知・ガント表示位置の自動テスト5コマンドを実行した。型チェックとビルド、ガント以外の4コマンドは成功したが、ガント表示位置のテストは、未来の日付へ移動できたかを確かめる最初の条件で失敗した。この結果だけでは、編集や同期の後に表示位置を保てるかは判定できない。結果と実行条件は[I9]に記録した。追加で</w:t>
+      </w:r>
+      <w:r>
+        <w:rPr>
+          <w:rFonts w:ascii="Consolas" w:hAnsi="Consolas"/>
+          <w:color w:val="0B6E66"/>
+          <w:sz w:val="20"/>
+        </w:rPr>
+        <w:t>npm run test:ux</w:t>
+      </w:r>
+      <w:r>
+        <w:rPr>
+          <w:rFonts w:ascii="Calibri" w:hAnsi="Calibri" w:eastAsia="Yu Mincho"/>
+        </w:rPr>
+        <w:t>を実行し、入力の保持と再試行、年次繰り返し、列幅変更、キーボード操作などの画面の検査は成功した。この追加確認は10月17日の15コマンドすべてを再実行したものではない。インストーラーは再作成しておらず、配布物が現在の画面と同じ実装であることは今回確認していない。</w:t>
+      </w:r>
+    </w:p>
+    <w:p>
       <w:pPr>
         <w:pStyle w:val="Heading2"/>
       </w:pPr>
@@ -11560,7 +11622,7 @@
         <w:rPr>
           <w:rFonts w:ascii="Calibri" w:hAnsi="Calibri" w:eastAsia="Yu Mincho"/>
         </w:rPr>
-        <w:t>型チェックとビルドはすべて成功した。自動テストは、時間切れの原因となったタイマーを直したあと、15コマンドすべてが合格した。10月9日の全体確認で見つけた13件の不具合は修正した。以上から、目指した五つの姿に対応する機能を実装できたと判断する。</w:t>
+        <w:t>型チェックとビルドはすべて成功した。自動テストは、時間切れの原因となったタイマーを直したあと、15コマンドすべてが合格した。10月9日の全体確認で見つけた13件の不具合は修正した。これらは10月17日の結果である。10月21日の追加確認では型チェックとビルド、関連テストとUIテストが成功した一方、ガント表示位置テストが最初の条件で失敗した。目指した五つの姿に対応する機能は実装したが、最新実装の品質確認にはこの未解決事項が残る[I9]。</w:t>
       </w:r>
     </w:p>
     <w:p>
@@ -11710,7 +11772,7 @@
         <w:rPr>
           <w:rFonts w:ascii="Calibri" w:hAnsi="Calibri" w:eastAsia="Yu Mincho"/>
         </w:rPr>
-        <w:t>, 「HAKOBI」, 2026年10月17日参照。</w:t>
+        <w:t>, 「HAKOBI」, 2026年10月21日参照。</w:t>
       </w:r>
     </w:p>
     <w:p>
@@ -11755,7 +11817,7 @@
         <w:rPr>
           <w:rFonts w:ascii="Calibri" w:hAnsi="Calibri" w:eastAsia="Yu Mincho"/>
         </w:rPr>
-        <w:t>, 開発者向けの設計メモ（技術構成、実装メモ）, 2026年10月17日参照。</w:t>
+        <w:t>, 開発者向けの設計メモ（技術構成、実装メモ）, 2026年10月21日参照。</w:t>
       </w:r>
     </w:p>
     <w:p>
@@ -11786,7 +11848,7 @@
         <w:rPr>
           <w:rFonts w:ascii="Calibri" w:hAnsi="Calibri" w:eastAsia="Yu Mincho"/>
         </w:rPr>
-        <w:t>, 「HAKOBI のチーム接続と運用」, 2026年10月17日参照。</w:t>
+        <w:t>, 「HAKOBI のチーム接続と運用」, 2026年10月21日参照。</w:t>
       </w:r>
     </w:p>
     <w:p>
@@ -11925,6 +11987,264 @@
           <w:rFonts w:ascii="Calibri" w:hAnsi="Calibri" w:eastAsia="Yu Mincho"/>
         </w:rPr>
         <w:t>, 「チームの仕事が見える業務管理ツール HAKOBI を作りました」（社内レポート版）, 2026年10月17日。画面の図の元にしたデモの撮影も同じ日に行った。</w:t>
+      </w:r>
+    </w:p>
+    <w:p>
+      <w:pPr>
+        <w:spacing w:after="60" w:line="312" w:lineRule="auto"/>
+        <w:ind w:left="540" w:hanging="279"/>
+        <w:jc w:val="left"/>
+        <w:numPr>
+          <w:ilvl w:val="0"/>
+          <w:numId w:val="11"/>
+        </w:numPr>
+      </w:pPr>
+      <w:r>
+        <w:rPr>
+          <w:rFonts w:ascii="Calibri" w:hAnsi="Calibri" w:eastAsia="Yu Mincho"/>
+        </w:rPr>
+        <w:t>[I8] コミット</w:t>
+      </w:r>
+      <w:r>
+        <w:rPr>
+          <w:rFonts w:ascii="Consolas" w:hAnsi="Consolas"/>
+          <w:color w:val="0B6E66"/>
+          <w:sz w:val="20"/>
+        </w:rPr>
+        <w:t>a823ba5</w:t>
+      </w:r>
+      <w:r>
+        <w:rPr>
+          <w:rFonts w:ascii="Calibri" w:hAnsi="Calibri" w:eastAsia="Yu Mincho"/>
+        </w:rPr>
+        <w:t>の実装。</w:t>
+      </w:r>
+      <w:r>
+        <w:rPr>
+          <w:rFonts w:ascii="Consolas" w:hAnsi="Consolas"/>
+          <w:color w:val="0B6E66"/>
+          <w:sz w:val="20"/>
+        </w:rPr>
+        <w:t>src/renderer/src/App.tsx</w:t>
+      </w:r>
+      <w:r>
+        <w:rPr>
+          <w:rFonts w:ascii="Calibri" w:hAnsi="Calibri" w:eastAsia="Yu Mincho"/>
+        </w:rPr>
+        <w:t>、</w:t>
+      </w:r>
+      <w:r>
+        <w:rPr>
+          <w:rFonts w:ascii="Consolas" w:hAnsi="Consolas"/>
+          <w:color w:val="0B6E66"/>
+          <w:sz w:val="20"/>
+        </w:rPr>
+        <w:t>components/GanttView.tsx</w:t>
+      </w:r>
+      <w:r>
+        <w:rPr>
+          <w:rFonts w:ascii="Calibri" w:hAnsi="Calibri" w:eastAsia="Yu Mincho"/>
+        </w:rPr>
+        <w:t>、</w:t>
+      </w:r>
+      <w:r>
+        <w:rPr>
+          <w:rFonts w:ascii="Consolas" w:hAnsi="Consolas"/>
+          <w:color w:val="0B6E66"/>
+          <w:sz w:val="20"/>
+        </w:rPr>
+        <w:t>components/ReportView.tsx</w:t>
+      </w:r>
+      <w:r>
+        <w:rPr>
+          <w:rFonts w:ascii="Calibri" w:hAnsi="Calibri" w:eastAsia="Yu Mincho"/>
+        </w:rPr>
+        <w:t>、</w:t>
+      </w:r>
+      <w:r>
+        <w:rPr>
+          <w:rFonts w:ascii="Consolas" w:hAnsi="Consolas"/>
+          <w:color w:val="0B6E66"/>
+          <w:sz w:val="20"/>
+        </w:rPr>
+        <w:t>components/MeetingMode.tsx</w:t>
+      </w:r>
+      <w:r>
+        <w:rPr>
+          <w:rFonts w:ascii="Calibri" w:hAnsi="Calibri" w:eastAsia="Yu Mincho"/>
+        </w:rPr>
+        <w:t>、</w:t>
+      </w:r>
+      <w:r>
+        <w:rPr>
+          <w:rFonts w:ascii="Consolas" w:hAnsi="Consolas"/>
+          <w:color w:val="0B6E66"/>
+          <w:sz w:val="20"/>
+        </w:rPr>
+        <w:t>lib/scheduleHealth.ts</w:t>
+      </w:r>
+      <w:r>
+        <w:rPr>
+          <w:rFonts w:ascii="Calibri" w:hAnsi="Calibri" w:eastAsia="Yu Mincho"/>
+        </w:rPr>
+        <w:t>、</w:t>
+      </w:r>
+      <w:r>
+        <w:rPr>
+          <w:rFonts w:ascii="Consolas" w:hAnsi="Consolas"/>
+          <w:color w:val="0B6E66"/>
+          <w:sz w:val="20"/>
+        </w:rPr>
+        <w:t>lib/dueChanges.ts</w:t>
+      </w:r>
+      <w:r>
+        <w:rPr>
+          <w:rFonts w:ascii="Calibri" w:hAnsi="Calibri" w:eastAsia="Yu Mincho"/>
+        </w:rPr>
+        <w:t>、</w:t>
+      </w:r>
+      <w:r>
+        <w:rPr>
+          <w:rFonts w:ascii="Consolas" w:hAnsi="Consolas"/>
+          <w:color w:val="0B6E66"/>
+          <w:sz w:val="20"/>
+        </w:rPr>
+        <w:t>lib/recurrence.ts</w:t>
+      </w:r>
+      <w:r>
+        <w:rPr>
+          <w:rFonts w:ascii="Calibri" w:hAnsi="Calibri" w:eastAsia="Yu Mincho"/>
+        </w:rPr>
+        <w:t>、</w:t>
+      </w:r>
+      <w:r>
+        <w:rPr>
+          <w:rFonts w:ascii="Consolas" w:hAnsi="Consolas"/>
+          <w:color w:val="0B6E66"/>
+          <w:sz w:val="20"/>
+        </w:rPr>
+        <w:t>lib/recurrenceUndo.ts</w:t>
+      </w:r>
+      <w:r>
+        <w:rPr>
+          <w:rFonts w:ascii="Calibri" w:hAnsi="Calibri" w:eastAsia="Yu Mincho"/>
+        </w:rPr>
+        <w:t>（components・libは</w:t>
+      </w:r>
+      <w:r>
+        <w:rPr>
+          <w:rFonts w:ascii="Consolas" w:hAnsi="Consolas"/>
+          <w:color w:val="0B6E66"/>
+          <w:sz w:val="20"/>
+        </w:rPr>
+        <w:t>src/renderer/src/</w:t>
+      </w:r>
+      <w:r>
+        <w:rPr>
+          <w:rFonts w:ascii="Calibri" w:hAnsi="Calibri" w:eastAsia="Yu Mincho"/>
+        </w:rPr>
+        <w:t>以下）、</w:t>
+      </w:r>
+      <w:r>
+        <w:rPr>
+          <w:rFonts w:ascii="Consolas" w:hAnsi="Consolas"/>
+          <w:color w:val="0B6E66"/>
+          <w:sz w:val="20"/>
+        </w:rPr>
+        <w:t>src/main/db.ts</w:t>
+      </w:r>
+      <w:r>
+        <w:rPr>
+          <w:rFonts w:ascii="Calibri" w:hAnsi="Calibri" w:eastAsia="Yu Mincho"/>
+        </w:rPr>
+        <w:t>、</w:t>
+      </w:r>
+      <w:r>
+        <w:rPr>
+          <w:rFonts w:ascii="Consolas" w:hAnsi="Consolas"/>
+          <w:color w:val="0B6E66"/>
+          <w:sz w:val="20"/>
+        </w:rPr>
+        <w:t>server/src/db/todos.ts</w:t>
+      </w:r>
+      <w:r>
+        <w:rPr>
+          <w:rFonts w:ascii="Calibri" w:hAnsi="Calibri" w:eastAsia="Yu Mincho"/>
+        </w:rPr>
+        <w:t>、</w:t>
+      </w:r>
+      <w:r>
+        <w:rPr>
+          <w:rFonts w:ascii="Consolas" w:hAnsi="Consolas"/>
+          <w:color w:val="0B6E66"/>
+          <w:sz w:val="20"/>
+        </w:rPr>
+        <w:t>server/src/db/notifications.ts</w:t>
+      </w:r>
+      <w:r>
+        <w:rPr>
+          <w:rFonts w:ascii="Calibri" w:hAnsi="Calibri" w:eastAsia="Yu Mincho"/>
+        </w:rPr>
+        <w:t>。変更の経緯は</w:t>
+      </w:r>
+      <w:r>
+        <w:rPr>
+          <w:rFonts w:ascii="Consolas" w:hAnsi="Consolas"/>
+          <w:color w:val="0B6E66"/>
+          <w:sz w:val="20"/>
+        </w:rPr>
+        <w:t>UX_LOG.md</w:t>
+      </w:r>
+      <w:r>
+        <w:rPr>
+          <w:rFonts w:ascii="Calibri" w:hAnsi="Calibri" w:eastAsia="Yu Mincho"/>
+        </w:rPr>
+        <w:t>・</w:t>
+      </w:r>
+      <w:r>
+        <w:rPr>
+          <w:rFonts w:ascii="Consolas" w:hAnsi="Consolas"/>
+          <w:color w:val="0B6E66"/>
+          <w:sz w:val="20"/>
+        </w:rPr>
+        <w:t>UX_REPORT.md</w:t>
+      </w:r>
+      <w:r>
+        <w:rPr>
+          <w:rFonts w:ascii="Calibri" w:hAnsi="Calibri" w:eastAsia="Yu Mincho"/>
+        </w:rPr>
+        <w:t>。2026年10月21日参照。</w:t>
+      </w:r>
+    </w:p>
+    <w:p>
+      <w:pPr>
+        <w:spacing w:after="60" w:line="312" w:lineRule="auto"/>
+        <w:ind w:left="540" w:hanging="279"/>
+        <w:jc w:val="left"/>
+        <w:numPr>
+          <w:ilvl w:val="0"/>
+          <w:numId w:val="11"/>
+        </w:numPr>
+      </w:pPr>
+      <w:r>
+        <w:rPr>
+          <w:rFonts w:ascii="Calibri" w:hAnsi="Calibri" w:eastAsia="Yu Mincho"/>
+        </w:rPr>
+        <w:t xml:space="preserve">[I9] </w:t>
+      </w:r>
+      <w:r>
+        <w:rPr>
+          <w:rFonts w:ascii="Consolas" w:hAnsi="Consolas"/>
+          <w:color w:val="0B6E66"/>
+          <w:sz w:val="20"/>
+        </w:rPr>
+        <w:t>docs/hakobi-report/evidence/VALIDATION_20261021.md</w:t>
+      </w:r>
+      <w:r>
+        <w:rPr>
+          <w:rFonts w:ascii="Calibri" w:hAnsi="Calibri" w:eastAsia="Yu Mincho"/>
+        </w:rPr>
+        <w:t>, 最新仕様の照合と追加検証の記録, 2026年10月21日。</w:t>
       </w:r>
     </w:p>
     <w:p>
@@ -14246,6 +14566,7 @@
     <w:p>
       <w:pPr>
         <w:pStyle w:val="Heading1"/>
+        <w:pageBreakBefore/>
       </w:pPr>
       <w:r>
         <w:rPr>
@@ -14259,7 +14580,7 @@
         <w:rPr>
           <w:rFonts w:ascii="Calibri" w:hAnsi="Calibri" w:eastAsia="Yu Mincho"/>
         </w:rPr>
-        <w:t>本文で触れたHAKOBIの主な既定値を表B1に示す。値は2026年10月17日時点のコードと運用文書による[I2][I3]。</w:t>
+        <w:t>本文で触れたHAKOBIの主な既定値を表B1に示す。値は2026年10月21日時点のコードと運用文書による[I2][I3]。</w:t>
       </w:r>
     </w:p>
     <w:p>
@@ -15162,7 +15483,7 @@
                 <w:rFonts w:ascii="Calibri" w:hAnsi="Calibri" w:eastAsia="Yu Mincho"/>
                 <w:sz w:val="17"/>
               </w:rPr>
-              <w:t>予定より2日分以上の遅れ</w:t>
+              <w:t>予定より2日分以上、または50ポイント以上の差</w:t>
             </w:r>
           </w:p>
         </w:tc>
@@ -15194,7 +15515,7 @@
                 <w:rFonts w:ascii="Calibri" w:hAnsi="Calibri" w:eastAsia="Yu Mincho"/>
                 <w:sz w:val="17"/>
               </w:rPr>
-              <w:t>表示設定で変えられる</w:t>
+              <w:t>日数の条件は表示設定で変えられる（4.1節）</w:t>
             </w:r>
           </w:p>
         </w:tc>
@@ -15352,7 +15673,7 @@
                 <w:color w:val="0F1B2D"/>
                 <w:sz w:val="17"/>
               </w:rPr>
-              <w:t>ToDoリストの実施の割合</w:t>
+              <w:t>定例の途中経過</w:t>
             </w:r>
           </w:p>
         </w:tc>
@@ -15384,7 +15705,7 @@
                 <w:rFonts w:ascii="Calibri" w:hAnsi="Calibri" w:eastAsia="Yu Mincho"/>
                 <w:sz w:val="17"/>
               </w:rPr>
-              <w:t>終わった周期が5回以上</w:t>
+              <w:t>開始から12時間</w:t>
             </w:r>
           </w:p>
         </w:tc>
@@ -15416,7 +15737,7 @@
                 <w:rFonts w:ascii="Calibri" w:hAnsi="Calibri" w:eastAsia="Yu Mincho"/>
                 <w:sz w:val="17"/>
               </w:rPr>
-              <w:t>今の周期は数えない</w:t>
+              <w:t>端末のlocalStorageに保存。他のPCとは共有しない</w:t>
             </w:r>
           </w:p>
         </w:tc>
@@ -15462,7 +15783,7 @@
                 <w:color w:val="0F1B2D"/>
                 <w:sz w:val="17"/>
               </w:rPr>
-              <w:t>計画の時間割</w:t>
+              <w:t>ToDoリストの実施の割合</w:t>
             </w:r>
           </w:p>
         </w:tc>
@@ -15495,7 +15816,7 @@
                 <w:rFonts w:ascii="Calibri" w:hAnsi="Calibri" w:eastAsia="Yu Mincho"/>
                 <w:sz w:val="17"/>
               </w:rPr>
-              <w:t>15分単位</w:t>
+              <w:t>終わった周期が5回以上</w:t>
             </w:r>
           </w:p>
         </w:tc>
@@ -15509,6 +15830,116 @@
               <w:right w:val="single" w:sz="4" w:color="C9D3DB"/>
             </w:tcBorders>
             <w:shd w:val="clear" w:fill="FAFBFC"/>
+            <w:tcMar>
+              <w:top w:w="80" w:type="dxa"/>
+              <w:start w:w="120" w:type="dxa"/>
+              <w:bottom w:w="80" w:type="dxa"/>
+              <w:end w:w="120" w:type="dxa"/>
+            </w:tcMar>
+            <w:vAlign w:val="center"/>
+          </w:tcPr>
+          <w:p>
+            <w:pPr>
+              <w:spacing w:after="30" w:line="276" w:lineRule="auto"/>
+              <w:jc w:val="left"/>
+            </w:pPr>
+            <w:r/>
+            <w:r>
+              <w:rPr>
+                <w:rFonts w:ascii="Calibri" w:hAnsi="Calibri" w:eastAsia="Yu Mincho"/>
+                <w:sz w:val="17"/>
+              </w:rPr>
+              <w:t>今の周期は数えない</w:t>
+            </w:r>
+          </w:p>
+        </w:tc>
+      </w:tr>
+      <w:tr>
+        <w:trPr>
+          <w:cantSplit w:val="true"/>
+        </w:trPr>
+        <w:tc>
+          <w:tcPr>
+            <w:tcW w:type="dxa" w:w="2700"/>
+            <w:tcBorders>
+              <w:top w:val="single" w:sz="4" w:color="C9D3DB"/>
+              <w:left w:val="single" w:sz="4" w:color="C9D3DB"/>
+              <w:bottom w:val="single" w:sz="4" w:color="C9D3DB"/>
+              <w:right w:val="single" w:sz="4" w:color="C9D3DB"/>
+            </w:tcBorders>
+            <w:shd w:val="clear" w:fill="E7F5F3"/>
+            <w:tcMar>
+              <w:top w:w="80" w:type="dxa"/>
+              <w:start w:w="120" w:type="dxa"/>
+              <w:bottom w:w="80" w:type="dxa"/>
+              <w:end w:w="120" w:type="dxa"/>
+            </w:tcMar>
+            <w:vAlign w:val="center"/>
+          </w:tcPr>
+          <w:p>
+            <w:pPr>
+              <w:spacing w:after="30" w:line="276" w:lineRule="auto"/>
+              <w:jc w:val="left"/>
+            </w:pPr>
+            <w:r>
+              <w:rPr>
+                <w:rFonts w:ascii="Calibri" w:hAnsi="Calibri" w:eastAsia="Yu Gothic"/>
+                <w:b/>
+                <w:color w:val="0F1B2D"/>
+              </w:rPr>
+            </w:r>
+            <w:r>
+              <w:rPr>
+                <w:rFonts w:ascii="Calibri" w:hAnsi="Calibri" w:eastAsia="Yu Gothic"/>
+                <w:b/>
+                <w:color w:val="0F1B2D"/>
+                <w:sz w:val="17"/>
+              </w:rPr>
+              <w:t>計画の時間割</w:t>
+            </w:r>
+          </w:p>
+        </w:tc>
+        <w:tc>
+          <w:tcPr>
+            <w:tcW w:type="dxa" w:w="3060"/>
+            <w:tcBorders>
+              <w:top w:val="single" w:sz="4" w:color="C9D3DB"/>
+              <w:left w:val="single" w:sz="4" w:color="C9D3DB"/>
+              <w:bottom w:val="single" w:sz="4" w:color="C9D3DB"/>
+              <w:right w:val="single" w:sz="4" w:color="C9D3DB"/>
+            </w:tcBorders>
+            <w:tcMar>
+              <w:top w:w="80" w:type="dxa"/>
+              <w:start w:w="120" w:type="dxa"/>
+              <w:bottom w:w="80" w:type="dxa"/>
+              <w:end w:w="120" w:type="dxa"/>
+            </w:tcMar>
+            <w:vAlign w:val="center"/>
+          </w:tcPr>
+          <w:p>
+            <w:pPr>
+              <w:spacing w:after="30" w:line="276" w:lineRule="auto"/>
+              <w:jc w:val="left"/>
+            </w:pPr>
+            <w:r/>
+            <w:r>
+              <w:rPr>
+                <w:rFonts w:ascii="Calibri" w:hAnsi="Calibri" w:eastAsia="Yu Mincho"/>
+                <w:sz w:val="17"/>
+              </w:rPr>
+              <w:t>15分単位</w:t>
+            </w:r>
+          </w:p>
+        </w:tc>
+        <w:tc>
+          <w:tcPr>
+            <w:tcW w:type="dxa" w:w="3600"/>
+            <w:tcBorders>
+              <w:top w:val="single" w:sz="4" w:color="C9D3DB"/>
+              <w:left w:val="single" w:sz="4" w:color="C9D3DB"/>
+              <w:bottom w:val="single" w:sz="4" w:color="C9D3DB"/>
+              <w:right w:val="single" w:sz="4" w:color="C9D3DB"/>
+            </w:tcBorders>
             <w:tcMar>
               <w:top w:w="80" w:type="dxa"/>
               <w:start w:w="120" w:type="dxa"/>

</xml_diff>